<commit_message>
Modifique requisitos de aceptacion y mapa de procesos actual de  la empresa
</commit_message>
<xml_diff>
--- a/Actividades/roles y requisitos.docx
+++ b/Actividades/roles y requisitos.docx
@@ -389,18 +389,8 @@
                 <w:sz w:val="24"/>
                 <w:szCs w:val="24"/>
               </w:rPr>
-              <w:t xml:space="preserve">Software </w:t>
-            </w:r>
-            <w:proofErr w:type="spellStart"/>
-            <w:r>
-              <w:rPr>
-                <w:rFonts w:ascii="Times New Roman" w:hAnsi="Times New Roman" w:cs="Times New Roman"/>
-                <w:sz w:val="24"/>
-                <w:szCs w:val="24"/>
-              </w:rPr>
-              <w:t>Architect</w:t>
-            </w:r>
-            <w:proofErr w:type="spellEnd"/>
+              <w:t>Software Architect</w:t>
+            </w:r>
           </w:p>
         </w:tc>
         <w:tc>
@@ -518,41 +508,13 @@
                 <w:szCs w:val="24"/>
               </w:rPr>
             </w:pPr>
-            <w:proofErr w:type="spellStart"/>
             <w:r>
               <w:rPr>
                 <w:rFonts w:ascii="Times New Roman" w:hAnsi="Times New Roman" w:cs="Times New Roman"/>
                 <w:sz w:val="24"/>
                 <w:szCs w:val="24"/>
               </w:rPr>
-              <w:t>Backend</w:t>
-            </w:r>
-            <w:proofErr w:type="spellEnd"/>
-            <w:r>
-              <w:rPr>
-                <w:rFonts w:ascii="Times New Roman" w:hAnsi="Times New Roman" w:cs="Times New Roman"/>
-                <w:sz w:val="24"/>
-                <w:szCs w:val="24"/>
-              </w:rPr>
-              <w:t xml:space="preserve"> </w:t>
-            </w:r>
-            <w:proofErr w:type="spellStart"/>
-            <w:r>
-              <w:rPr>
-                <w:rFonts w:ascii="Times New Roman" w:hAnsi="Times New Roman" w:cs="Times New Roman"/>
-                <w:sz w:val="24"/>
-                <w:szCs w:val="24"/>
-              </w:rPr>
-              <w:t>Developer</w:t>
-            </w:r>
-            <w:proofErr w:type="spellEnd"/>
-            <w:r>
-              <w:rPr>
-                <w:rFonts w:ascii="Times New Roman" w:hAnsi="Times New Roman" w:cs="Times New Roman"/>
-                <w:sz w:val="24"/>
-                <w:szCs w:val="24"/>
-              </w:rPr>
-              <w:t xml:space="preserve"> &amp; DevOps</w:t>
+              <w:t>Backend Developer &amp; DevOps</w:t>
             </w:r>
           </w:p>
         </w:tc>
@@ -592,43 +554,7 @@
                 <w:sz w:val="24"/>
                 <w:szCs w:val="24"/>
               </w:rPr>
-              <w:t xml:space="preserve">Implementar servicios, </w:t>
-            </w:r>
-            <w:proofErr w:type="spellStart"/>
-            <w:r>
-              <w:rPr>
-                <w:rFonts w:ascii="Times New Roman" w:hAnsi="Times New Roman" w:cs="Times New Roman"/>
-                <w:sz w:val="24"/>
-                <w:szCs w:val="24"/>
-              </w:rPr>
-              <w:t>APIs</w:t>
-            </w:r>
-            <w:proofErr w:type="spellEnd"/>
-            <w:r>
-              <w:rPr>
-                <w:rFonts w:ascii="Times New Roman" w:hAnsi="Times New Roman" w:cs="Times New Roman"/>
-                <w:sz w:val="24"/>
-                <w:szCs w:val="24"/>
-              </w:rPr>
-              <w:t xml:space="preserve"> y base de datos (</w:t>
-            </w:r>
-            <w:proofErr w:type="spellStart"/>
-            <w:r>
-              <w:rPr>
-                <w:rFonts w:ascii="Times New Roman" w:hAnsi="Times New Roman" w:cs="Times New Roman"/>
-                <w:sz w:val="24"/>
-                <w:szCs w:val="24"/>
-              </w:rPr>
-              <w:t>Backend</w:t>
-            </w:r>
-            <w:proofErr w:type="spellEnd"/>
-            <w:r>
-              <w:rPr>
-                <w:rFonts w:ascii="Times New Roman" w:hAnsi="Times New Roman" w:cs="Times New Roman"/>
-                <w:sz w:val="24"/>
-                <w:szCs w:val="24"/>
-              </w:rPr>
-              <w:t>). Gestionar repositorios, control de versiones y despliegue (DevOps).</w:t>
+              <w:t>Implementar servicios, APIs y base de datos (Backend). Gestionar repositorios, control de versiones y despliegue (DevOps).</w:t>
             </w:r>
           </w:p>
         </w:tc>
@@ -706,23 +632,13 @@
                 <w:szCs w:val="24"/>
               </w:rPr>
             </w:pPr>
-            <w:proofErr w:type="spellStart"/>
             <w:r>
               <w:rPr>
                 <w:rFonts w:ascii="Times New Roman" w:hAnsi="Times New Roman" w:cs="Times New Roman"/>
                 <w:sz w:val="24"/>
                 <w:szCs w:val="24"/>
               </w:rPr>
-              <w:t>Frontend</w:t>
-            </w:r>
-            <w:proofErr w:type="spellEnd"/>
-            <w:r>
-              <w:rPr>
-                <w:rFonts w:ascii="Times New Roman" w:hAnsi="Times New Roman" w:cs="Times New Roman"/>
-                <w:sz w:val="24"/>
-                <w:szCs w:val="24"/>
-              </w:rPr>
-              <w:t xml:space="preserve"> Developer &amp; QA / Tester</w:t>
+              <w:t>Frontend Developer &amp; QA / Tester</w:t>
             </w:r>
           </w:p>
         </w:tc>
@@ -762,25 +678,7 @@
                 <w:sz w:val="24"/>
                 <w:szCs w:val="24"/>
               </w:rPr>
-              <w:t>Diseñar e implementar la interfaz y usabilidad (</w:t>
-            </w:r>
-            <w:proofErr w:type="spellStart"/>
-            <w:r>
-              <w:rPr>
-                <w:rFonts w:ascii="Times New Roman" w:hAnsi="Times New Roman" w:cs="Times New Roman"/>
-                <w:sz w:val="24"/>
-                <w:szCs w:val="24"/>
-              </w:rPr>
-              <w:t>Frontend</w:t>
-            </w:r>
-            <w:proofErr w:type="spellEnd"/>
-            <w:r>
-              <w:rPr>
-                <w:rFonts w:ascii="Times New Roman" w:hAnsi="Times New Roman" w:cs="Times New Roman"/>
-                <w:sz w:val="24"/>
-                <w:szCs w:val="24"/>
-              </w:rPr>
-              <w:t>). Diseñar casos de prueba, ejecutar pruebas y reportar fallos (QA).</w:t>
+              <w:t>Diseñar e implementar la interfaz y usabilidad (Frontend). Diseñar casos de prueba, ejecutar pruebas y reportar fallos (QA).</w:t>
             </w:r>
           </w:p>
         </w:tc>
@@ -954,25 +852,7 @@
           <w:sz w:val="24"/>
           <w:szCs w:val="24"/>
         </w:rPr>
-        <w:t>Nombre de usuario (</w:t>
-      </w:r>
-      <w:proofErr w:type="spellStart"/>
-      <w:r>
-        <w:rPr>
-          <w:rFonts w:ascii="Times New Roman" w:hAnsi="Times New Roman" w:cs="Times New Roman"/>
-          <w:sz w:val="24"/>
-          <w:szCs w:val="24"/>
-        </w:rPr>
-        <w:t>Username</w:t>
-      </w:r>
-      <w:proofErr w:type="spellEnd"/>
-      <w:r>
-        <w:rPr>
-          <w:rFonts w:ascii="Times New Roman" w:hAnsi="Times New Roman" w:cs="Times New Roman"/>
-          <w:sz w:val="24"/>
-          <w:szCs w:val="24"/>
-        </w:rPr>
-        <w:t>) y Contraseña cifrada para el acceso.</w:t>
+        <w:t>Nombre de usuario (Username) y Contraseña cifrada para el acceso.</w:t>
       </w:r>
     </w:p>
     <w:p>
@@ -1296,23 +1176,13 @@
           <w:szCs w:val="24"/>
         </w:rPr>
       </w:pPr>
-      <w:proofErr w:type="gramStart"/>
       <w:r>
         <w:rPr>
           <w:rFonts w:ascii="Times New Roman" w:hAnsi="Times New Roman" w:cs="Times New Roman"/>
           <w:sz w:val="24"/>
           <w:szCs w:val="24"/>
         </w:rPr>
-        <w:t>Total</w:t>
-      </w:r>
-      <w:proofErr w:type="gramEnd"/>
-      <w:r>
-        <w:rPr>
-          <w:rFonts w:ascii="Times New Roman" w:hAnsi="Times New Roman" w:cs="Times New Roman"/>
-          <w:sz w:val="24"/>
-          <w:szCs w:val="24"/>
-        </w:rPr>
-        <w:t xml:space="preserve"> a pagar.</w:t>
+        <w:t>Total a pagar.</w:t>
       </w:r>
     </w:p>
     <w:p>
@@ -1525,28 +1395,26 @@
         <w:tblLook w:val="04A0" w:firstRow="1" w:lastRow="0" w:firstColumn="1" w:lastColumn="0" w:noHBand="0" w:noVBand="1"/>
       </w:tblPr>
       <w:tblGrid>
-        <w:gridCol w:w="1201"/>
-        <w:gridCol w:w="1739"/>
-        <w:gridCol w:w="1658"/>
-        <w:gridCol w:w="2232"/>
-        <w:gridCol w:w="1998"/>
+        <w:gridCol w:w="1129"/>
+        <w:gridCol w:w="1418"/>
+        <w:gridCol w:w="1819"/>
+        <w:gridCol w:w="2307"/>
+        <w:gridCol w:w="2155"/>
       </w:tblGrid>
       <w:tr>
         <w:tc>
           <w:tcPr>
-            <w:tcW w:w="0" w:type="auto"/>
-            <w:hideMark/>
-          </w:tcPr>
-          <w:p>
-            <w:pPr>
-              <w:tabs>
-                <w:tab w:val="left" w:pos="5730"/>
-              </w:tabs>
-              <w:spacing w:after="160"/>
-              <w:rPr>
-                <w:rFonts w:ascii="Times New Roman" w:hAnsi="Times New Roman" w:cs="Times New Roman"/>
-                <w:sz w:val="24"/>
-                <w:szCs w:val="24"/>
+            <w:tcW w:w="1129" w:type="dxa"/>
+            <w:hideMark/>
+          </w:tcPr>
+          <w:p>
+            <w:pPr>
+              <w:tabs>
+                <w:tab w:val="left" w:pos="5730"/>
+              </w:tabs>
+              <w:spacing w:after="40" w:line="276" w:lineRule="auto"/>
+              <w:rPr>
+                <w:rFonts w:ascii="Times New Roman" w:hAnsi="Times New Roman" w:cs="Times New Roman"/>
               </w:rPr>
             </w:pPr>
             <w:r>
@@ -1554,60 +1422,50 @@
                 <w:rFonts w:ascii="Times New Roman" w:hAnsi="Times New Roman" w:cs="Times New Roman"/>
                 <w:b/>
                 <w:bCs/>
-                <w:sz w:val="24"/>
-                <w:szCs w:val="24"/>
               </w:rPr>
               <w:lastRenderedPageBreak/>
-              <w:t>ID Requisito</w:t>
-            </w:r>
-          </w:p>
-        </w:tc>
-        <w:tc>
-          <w:tcPr>
-            <w:tcW w:w="0" w:type="auto"/>
-            <w:hideMark/>
-          </w:tcPr>
-          <w:p>
-            <w:pPr>
-              <w:tabs>
-                <w:tab w:val="left" w:pos="5730"/>
-              </w:tabs>
-              <w:spacing w:after="160"/>
-              <w:rPr>
-                <w:rFonts w:ascii="Times New Roman" w:hAnsi="Times New Roman" w:cs="Times New Roman"/>
-                <w:sz w:val="24"/>
-                <w:szCs w:val="24"/>
-              </w:rPr>
-            </w:pPr>
-            <w:proofErr w:type="gramStart"/>
+              <w:t>Código</w:t>
+            </w:r>
+          </w:p>
+        </w:tc>
+        <w:tc>
+          <w:tcPr>
+            <w:tcW w:w="1418" w:type="dxa"/>
+            <w:hideMark/>
+          </w:tcPr>
+          <w:p>
+            <w:pPr>
+              <w:tabs>
+                <w:tab w:val="left" w:pos="5730"/>
+              </w:tabs>
+              <w:spacing w:after="40" w:line="276" w:lineRule="auto"/>
+              <w:rPr>
+                <w:rFonts w:ascii="Times New Roman" w:hAnsi="Times New Roman" w:cs="Times New Roman"/>
+              </w:rPr>
+            </w:pPr>
             <w:r>
               <w:rPr>
                 <w:rFonts w:ascii="Times New Roman" w:hAnsi="Times New Roman" w:cs="Times New Roman"/>
                 <w:b/>
                 <w:bCs/>
-                <w:sz w:val="24"/>
-                <w:szCs w:val="24"/>
-              </w:rPr>
-              <w:t>Funcionalidad a Evaluar</w:t>
-            </w:r>
-            <w:proofErr w:type="gramEnd"/>
-          </w:p>
-        </w:tc>
-        <w:tc>
-          <w:tcPr>
-            <w:tcW w:w="0" w:type="auto"/>
-            <w:hideMark/>
-          </w:tcPr>
-          <w:p>
-            <w:pPr>
-              <w:tabs>
-                <w:tab w:val="left" w:pos="5730"/>
-              </w:tabs>
-              <w:spacing w:after="160"/>
-              <w:rPr>
-                <w:rFonts w:ascii="Times New Roman" w:hAnsi="Times New Roman" w:cs="Times New Roman"/>
-                <w:sz w:val="24"/>
-                <w:szCs w:val="24"/>
+              </w:rPr>
+              <w:t>¿Qué parte del programa probamos?</w:t>
+            </w:r>
+          </w:p>
+        </w:tc>
+        <w:tc>
+          <w:tcPr>
+            <w:tcW w:w="1819" w:type="dxa"/>
+            <w:hideMark/>
+          </w:tcPr>
+          <w:p>
+            <w:pPr>
+              <w:tabs>
+                <w:tab w:val="left" w:pos="5730"/>
+              </w:tabs>
+              <w:spacing w:after="40" w:line="276" w:lineRule="auto"/>
+              <w:rPr>
+                <w:rFonts w:ascii="Times New Roman" w:hAnsi="Times New Roman" w:cs="Times New Roman"/>
               </w:rPr>
             </w:pPr>
             <w:r>
@@ -1615,10 +1473,8 @@
                 <w:rFonts w:ascii="Times New Roman" w:hAnsi="Times New Roman" w:cs="Times New Roman"/>
                 <w:b/>
                 <w:bCs/>
-                <w:sz w:val="24"/>
-                <w:szCs w:val="24"/>
-              </w:rPr>
-              <w:t>Condición de Aceptación</w:t>
+              </w:rPr>
+              <w:t>¿Qué vamos a hacer en la prueba?</w:t>
             </w:r>
           </w:p>
         </w:tc>
@@ -1632,11 +1488,9 @@
               <w:tabs>
                 <w:tab w:val="left" w:pos="5730"/>
               </w:tabs>
-              <w:spacing w:after="160"/>
-              <w:rPr>
-                <w:rFonts w:ascii="Times New Roman" w:hAnsi="Times New Roman" w:cs="Times New Roman"/>
-                <w:sz w:val="24"/>
-                <w:szCs w:val="24"/>
+              <w:spacing w:after="40" w:line="276" w:lineRule="auto"/>
+              <w:rPr>
+                <w:rFonts w:ascii="Times New Roman" w:hAnsi="Times New Roman" w:cs="Times New Roman"/>
               </w:rPr>
             </w:pPr>
             <w:r>
@@ -1644,10 +1498,8 @@
                 <w:rFonts w:ascii="Times New Roman" w:hAnsi="Times New Roman" w:cs="Times New Roman"/>
                 <w:b/>
                 <w:bCs/>
-                <w:sz w:val="24"/>
-                <w:szCs w:val="24"/>
-              </w:rPr>
-              <w:t>Resultado Esperado</w:t>
+              </w:rPr>
+              <w:t>¿Qué tiene que hacer el programa?</w:t>
             </w:r>
           </w:p>
         </w:tc>
@@ -1661,11 +1513,9 @@
               <w:tabs>
                 <w:tab w:val="left" w:pos="5730"/>
               </w:tabs>
-              <w:spacing w:after="160"/>
-              <w:rPr>
-                <w:rFonts w:ascii="Times New Roman" w:hAnsi="Times New Roman" w:cs="Times New Roman"/>
-                <w:sz w:val="24"/>
-                <w:szCs w:val="24"/>
+              <w:spacing w:after="40" w:line="276" w:lineRule="auto"/>
+              <w:rPr>
+                <w:rFonts w:ascii="Times New Roman" w:hAnsi="Times New Roman" w:cs="Times New Roman"/>
               </w:rPr>
             </w:pPr>
             <w:r>
@@ -1673,10 +1523,8 @@
                 <w:rFonts w:ascii="Times New Roman" w:hAnsi="Times New Roman" w:cs="Times New Roman"/>
                 <w:b/>
                 <w:bCs/>
-                <w:sz w:val="24"/>
-                <w:szCs w:val="24"/>
-              </w:rPr>
-              <w:t>Validación por el usuario</w:t>
+              </w:rPr>
+              <w:t>¿Cómo sabemos que quedó bien? (Checklist del dueño)</w:t>
             </w:r>
           </w:p>
         </w:tc>
@@ -1684,19 +1532,17 @@
       <w:tr>
         <w:tc>
           <w:tcPr>
-            <w:tcW w:w="0" w:type="auto"/>
-            <w:hideMark/>
-          </w:tcPr>
-          <w:p>
-            <w:pPr>
-              <w:tabs>
-                <w:tab w:val="left" w:pos="5730"/>
-              </w:tabs>
-              <w:spacing w:after="160"/>
-              <w:rPr>
-                <w:rFonts w:ascii="Times New Roman" w:hAnsi="Times New Roman" w:cs="Times New Roman"/>
-                <w:sz w:val="24"/>
-                <w:szCs w:val="24"/>
+            <w:tcW w:w="1129" w:type="dxa"/>
+            <w:hideMark/>
+          </w:tcPr>
+          <w:p>
+            <w:pPr>
+              <w:tabs>
+                <w:tab w:val="left" w:pos="5730"/>
+              </w:tabs>
+              <w:spacing w:after="40" w:line="276" w:lineRule="auto"/>
+              <w:rPr>
+                <w:rFonts w:ascii="Times New Roman" w:hAnsi="Times New Roman" w:cs="Times New Roman"/>
               </w:rPr>
             </w:pPr>
             <w:r>
@@ -1704,8 +1550,6 @@
                 <w:rFonts w:ascii="Times New Roman" w:hAnsi="Times New Roman" w:cs="Times New Roman"/>
                 <w:b/>
                 <w:bCs/>
-                <w:sz w:val="24"/>
-                <w:szCs w:val="24"/>
               </w:rPr>
               <w:t>ACC-01</w:t>
             </w:r>
@@ -1713,6 +1557,54 @@
         </w:tc>
         <w:tc>
           <w:tcPr>
+            <w:tcW w:w="1418" w:type="dxa"/>
+            <w:hideMark/>
+          </w:tcPr>
+          <w:p>
+            <w:pPr>
+              <w:tabs>
+                <w:tab w:val="left" w:pos="5730"/>
+              </w:tabs>
+              <w:spacing w:after="40" w:line="276" w:lineRule="auto"/>
+              <w:rPr>
+                <w:rFonts w:ascii="Times New Roman" w:hAnsi="Times New Roman" w:cs="Times New Roman"/>
+              </w:rPr>
+            </w:pPr>
+            <w:r>
+              <w:rPr>
+                <w:rFonts w:ascii="Times New Roman" w:hAnsi="Times New Roman" w:cs="Times New Roman"/>
+                <w:b/>
+                <w:bCs/>
+              </w:rPr>
+              <w:t>Ingreso de Empleados</w:t>
+            </w:r>
+          </w:p>
+        </w:tc>
+        <w:tc>
+          <w:tcPr>
+            <w:tcW w:w="1819" w:type="dxa"/>
+            <w:hideMark/>
+          </w:tcPr>
+          <w:p>
+            <w:pPr>
+              <w:tabs>
+                <w:tab w:val="left" w:pos="5730"/>
+              </w:tabs>
+              <w:spacing w:after="40" w:line="276" w:lineRule="auto"/>
+              <w:rPr>
+                <w:rFonts w:ascii="Times New Roman" w:hAnsi="Times New Roman" w:cs="Times New Roman"/>
+              </w:rPr>
+            </w:pPr>
+            <w:r>
+              <w:rPr>
+                <w:rFonts w:ascii="Times New Roman" w:hAnsi="Times New Roman" w:cs="Times New Roman"/>
+              </w:rPr>
+              <w:t>Un vendedor entra al programa usando su usuario y contraseña correctos.</w:t>
+            </w:r>
+          </w:p>
+        </w:tc>
+        <w:tc>
+          <w:tcPr>
             <w:tcW w:w="0" w:type="auto"/>
             <w:hideMark/>
           </w:tcPr>
@@ -1721,20 +1613,30 @@
               <w:tabs>
                 <w:tab w:val="left" w:pos="5730"/>
               </w:tabs>
-              <w:spacing w:after="160"/>
-              <w:rPr>
-                <w:rFonts w:ascii="Times New Roman" w:hAnsi="Times New Roman" w:cs="Times New Roman"/>
-                <w:sz w:val="24"/>
-                <w:szCs w:val="24"/>
-              </w:rPr>
-            </w:pPr>
-            <w:r>
-              <w:rPr>
-                <w:rFonts w:ascii="Times New Roman" w:hAnsi="Times New Roman" w:cs="Times New Roman"/>
-                <w:sz w:val="24"/>
-                <w:szCs w:val="24"/>
-              </w:rPr>
-              <w:t>Control de Acceso (Login)</w:t>
+              <w:spacing w:after="40" w:line="276" w:lineRule="auto"/>
+              <w:rPr>
+                <w:rFonts w:ascii="Times New Roman" w:hAnsi="Times New Roman" w:cs="Times New Roman"/>
+              </w:rPr>
+            </w:pPr>
+            <w:r>
+              <w:rPr>
+                <w:rFonts w:ascii="Times New Roman" w:hAnsi="Times New Roman" w:cs="Times New Roman"/>
+              </w:rPr>
+              <w:t xml:space="preserve">El programa lo deja entrar, pero </w:t>
+            </w:r>
+            <w:r>
+              <w:rPr>
+                <w:rFonts w:ascii="Times New Roman" w:hAnsi="Times New Roman" w:cs="Times New Roman"/>
+                <w:b/>
+                <w:bCs/>
+              </w:rPr>
+              <w:t>solo</w:t>
+            </w:r>
+            <w:r>
+              <w:rPr>
+                <w:rFonts w:ascii="Times New Roman" w:hAnsi="Times New Roman" w:cs="Times New Roman"/>
+              </w:rPr>
+              <w:t xml:space="preserve"> le muestra la pantalla para vender y buscar productos. No le muestra las opciones del gerente.</w:t>
             </w:r>
           </w:p>
         </w:tc>
@@ -1748,74 +1650,16 @@
               <w:tabs>
                 <w:tab w:val="left" w:pos="5730"/>
               </w:tabs>
-              <w:spacing w:after="160"/>
-              <w:rPr>
-                <w:rFonts w:ascii="Times New Roman" w:hAnsi="Times New Roman" w:cs="Times New Roman"/>
-                <w:sz w:val="24"/>
-                <w:szCs w:val="24"/>
-              </w:rPr>
-            </w:pPr>
-            <w:r>
-              <w:rPr>
-                <w:rFonts w:ascii="Times New Roman" w:hAnsi="Times New Roman" w:cs="Times New Roman"/>
-                <w:sz w:val="24"/>
-                <w:szCs w:val="24"/>
-              </w:rPr>
-              <w:t>Un empleado intenta ingresar al sistema con sus credenciales válidas.</w:t>
-            </w:r>
-          </w:p>
-        </w:tc>
-        <w:tc>
-          <w:tcPr>
-            <w:tcW w:w="0" w:type="auto"/>
-            <w:hideMark/>
-          </w:tcPr>
-          <w:p>
-            <w:pPr>
-              <w:tabs>
-                <w:tab w:val="left" w:pos="5730"/>
-              </w:tabs>
-              <w:spacing w:after="160"/>
-              <w:rPr>
-                <w:rFonts w:ascii="Times New Roman" w:hAnsi="Times New Roman" w:cs="Times New Roman"/>
-                <w:sz w:val="24"/>
-                <w:szCs w:val="24"/>
-              </w:rPr>
-            </w:pPr>
-            <w:r>
-              <w:rPr>
-                <w:rFonts w:ascii="Times New Roman" w:hAnsi="Times New Roman" w:cs="Times New Roman"/>
-                <w:sz w:val="24"/>
-                <w:szCs w:val="24"/>
-              </w:rPr>
-              <w:t>El sistema permite el acceso y muestra únicamente el módulo de ventas y consulta de catálogo, bloqueando funciones de gerente.</w:t>
-            </w:r>
-          </w:p>
-        </w:tc>
-        <w:tc>
-          <w:tcPr>
-            <w:tcW w:w="0" w:type="auto"/>
-            <w:hideMark/>
-          </w:tcPr>
-          <w:p>
-            <w:pPr>
-              <w:tabs>
-                <w:tab w:val="left" w:pos="5730"/>
-              </w:tabs>
-              <w:spacing w:after="160"/>
-              <w:rPr>
-                <w:rFonts w:ascii="Times New Roman" w:hAnsi="Times New Roman" w:cs="Times New Roman"/>
-                <w:sz w:val="24"/>
-                <w:szCs w:val="24"/>
-              </w:rPr>
-            </w:pPr>
-            <w:r>
-              <w:rPr>
-                <w:rFonts w:ascii="Times New Roman" w:hAnsi="Times New Roman" w:cs="Times New Roman"/>
-                <w:sz w:val="24"/>
-                <w:szCs w:val="24"/>
-              </w:rPr>
-              <w:t>El usuario verifica que no puede acceder a reportes ni agregar inventario.</w:t>
+              <w:spacing w:after="40" w:line="276" w:lineRule="auto"/>
+              <w:rPr>
+                <w:rFonts w:ascii="Times New Roman" w:hAnsi="Times New Roman" w:cs="Times New Roman"/>
+              </w:rPr>
+            </w:pPr>
+            <w:r>
+              <w:rPr>
+                <w:rFonts w:ascii="Times New Roman" w:hAnsi="Times New Roman" w:cs="Times New Roman"/>
+              </w:rPr>
+              <w:t>El vendedor intenta ver los reportes de ganancias o meter mercancía nueva, y el programa no lo deja.</w:t>
             </w:r>
           </w:p>
         </w:tc>
@@ -1823,19 +1667,17 @@
       <w:tr>
         <w:tc>
           <w:tcPr>
-            <w:tcW w:w="0" w:type="auto"/>
-            <w:hideMark/>
-          </w:tcPr>
-          <w:p>
-            <w:pPr>
-              <w:tabs>
-                <w:tab w:val="left" w:pos="5730"/>
-              </w:tabs>
-              <w:spacing w:after="160"/>
-              <w:rPr>
-                <w:rFonts w:ascii="Times New Roman" w:hAnsi="Times New Roman" w:cs="Times New Roman"/>
-                <w:sz w:val="24"/>
-                <w:szCs w:val="24"/>
+            <w:tcW w:w="1129" w:type="dxa"/>
+            <w:hideMark/>
+          </w:tcPr>
+          <w:p>
+            <w:pPr>
+              <w:tabs>
+                <w:tab w:val="left" w:pos="5730"/>
+              </w:tabs>
+              <w:spacing w:after="40" w:line="276" w:lineRule="auto"/>
+              <w:rPr>
+                <w:rFonts w:ascii="Times New Roman" w:hAnsi="Times New Roman" w:cs="Times New Roman"/>
               </w:rPr>
             </w:pPr>
             <w:r>
@@ -1843,8 +1685,6 @@
                 <w:rFonts w:ascii="Times New Roman" w:hAnsi="Times New Roman" w:cs="Times New Roman"/>
                 <w:b/>
                 <w:bCs/>
-                <w:sz w:val="24"/>
-                <w:szCs w:val="24"/>
               </w:rPr>
               <w:t>ACC-02</w:t>
             </w:r>
@@ -1852,6 +1692,54 @@
         </w:tc>
         <w:tc>
           <w:tcPr>
+            <w:tcW w:w="1418" w:type="dxa"/>
+            <w:hideMark/>
+          </w:tcPr>
+          <w:p>
+            <w:pPr>
+              <w:tabs>
+                <w:tab w:val="left" w:pos="5730"/>
+              </w:tabs>
+              <w:spacing w:after="40" w:line="276" w:lineRule="auto"/>
+              <w:rPr>
+                <w:rFonts w:ascii="Times New Roman" w:hAnsi="Times New Roman" w:cs="Times New Roman"/>
+              </w:rPr>
+            </w:pPr>
+            <w:r>
+              <w:rPr>
+                <w:rFonts w:ascii="Times New Roman" w:hAnsi="Times New Roman" w:cs="Times New Roman"/>
+                <w:b/>
+                <w:bCs/>
+              </w:rPr>
+              <w:t>Hacer una Venta y dar Recibo</w:t>
+            </w:r>
+          </w:p>
+        </w:tc>
+        <w:tc>
+          <w:tcPr>
+            <w:tcW w:w="1819" w:type="dxa"/>
+            <w:hideMark/>
+          </w:tcPr>
+          <w:p>
+            <w:pPr>
+              <w:tabs>
+                <w:tab w:val="left" w:pos="5730"/>
+              </w:tabs>
+              <w:spacing w:after="40" w:line="276" w:lineRule="auto"/>
+              <w:rPr>
+                <w:rFonts w:ascii="Times New Roman" w:hAnsi="Times New Roman" w:cs="Times New Roman"/>
+              </w:rPr>
+            </w:pPr>
+            <w:r>
+              <w:rPr>
+                <w:rFonts w:ascii="Times New Roman" w:hAnsi="Times New Roman" w:cs="Times New Roman"/>
+              </w:rPr>
+              <w:t>El vendedor escoge 3 productos distintos para vendérselos a un cliente y anota que ya le pagaron.</w:t>
+            </w:r>
+          </w:p>
+        </w:tc>
+        <w:tc>
+          <w:tcPr>
             <w:tcW w:w="0" w:type="auto"/>
             <w:hideMark/>
           </w:tcPr>
@@ -1860,20 +1748,16 @@
               <w:tabs>
                 <w:tab w:val="left" w:pos="5730"/>
               </w:tabs>
-              <w:spacing w:after="160"/>
-              <w:rPr>
-                <w:rFonts w:ascii="Times New Roman" w:hAnsi="Times New Roman" w:cs="Times New Roman"/>
-                <w:sz w:val="24"/>
-                <w:szCs w:val="24"/>
-              </w:rPr>
-            </w:pPr>
-            <w:r>
-              <w:rPr>
-                <w:rFonts w:ascii="Times New Roman" w:hAnsi="Times New Roman" w:cs="Times New Roman"/>
-                <w:sz w:val="24"/>
-                <w:szCs w:val="24"/>
-              </w:rPr>
-              <w:t>Registro de Venta y Factura</w:t>
+              <w:spacing w:after="40" w:line="276" w:lineRule="auto"/>
+              <w:rPr>
+                <w:rFonts w:ascii="Times New Roman" w:hAnsi="Times New Roman" w:cs="Times New Roman"/>
+              </w:rPr>
+            </w:pPr>
+            <w:r>
+              <w:rPr>
+                <w:rFonts w:ascii="Times New Roman" w:hAnsi="Times New Roman" w:cs="Times New Roman"/>
+              </w:rPr>
+              <w:t>El programa hace la suma matemática correcta, guarda la venta y saca el recibo o factura con lo que compró el cliente.</w:t>
             </w:r>
           </w:p>
         </w:tc>
@@ -1887,74 +1771,16 @@
               <w:tabs>
                 <w:tab w:val="left" w:pos="5730"/>
               </w:tabs>
-              <w:spacing w:after="160"/>
-              <w:rPr>
-                <w:rFonts w:ascii="Times New Roman" w:hAnsi="Times New Roman" w:cs="Times New Roman"/>
-                <w:sz w:val="24"/>
-                <w:szCs w:val="24"/>
-              </w:rPr>
-            </w:pPr>
-            <w:r>
-              <w:rPr>
-                <w:rFonts w:ascii="Times New Roman" w:hAnsi="Times New Roman" w:cs="Times New Roman"/>
-                <w:sz w:val="24"/>
-                <w:szCs w:val="24"/>
-              </w:rPr>
-              <w:t>El vendedor escanea o selecciona 3 productos diferentes y registra el pago del cliente.</w:t>
-            </w:r>
-          </w:p>
-        </w:tc>
-        <w:tc>
-          <w:tcPr>
-            <w:tcW w:w="0" w:type="auto"/>
-            <w:hideMark/>
-          </w:tcPr>
-          <w:p>
-            <w:pPr>
-              <w:tabs>
-                <w:tab w:val="left" w:pos="5730"/>
-              </w:tabs>
-              <w:spacing w:after="160"/>
-              <w:rPr>
-                <w:rFonts w:ascii="Times New Roman" w:hAnsi="Times New Roman" w:cs="Times New Roman"/>
-                <w:sz w:val="24"/>
-                <w:szCs w:val="24"/>
-              </w:rPr>
-            </w:pPr>
-            <w:r>
-              <w:rPr>
-                <w:rFonts w:ascii="Times New Roman" w:hAnsi="Times New Roman" w:cs="Times New Roman"/>
-                <w:sz w:val="24"/>
-                <w:szCs w:val="24"/>
-              </w:rPr>
-              <w:t>El sistema calcula la suma correcta, registra la transacción y emite la factura con el detalle de la compra.</w:t>
-            </w:r>
-          </w:p>
-        </w:tc>
-        <w:tc>
-          <w:tcPr>
-            <w:tcW w:w="0" w:type="auto"/>
-            <w:hideMark/>
-          </w:tcPr>
-          <w:p>
-            <w:pPr>
-              <w:tabs>
-                <w:tab w:val="left" w:pos="5730"/>
-              </w:tabs>
-              <w:spacing w:after="160"/>
-              <w:rPr>
-                <w:rFonts w:ascii="Times New Roman" w:hAnsi="Times New Roman" w:cs="Times New Roman"/>
-                <w:sz w:val="24"/>
-                <w:szCs w:val="24"/>
-              </w:rPr>
-            </w:pPr>
-            <w:r>
-              <w:rPr>
-                <w:rFonts w:ascii="Times New Roman" w:hAnsi="Times New Roman" w:cs="Times New Roman"/>
-                <w:sz w:val="24"/>
-                <w:szCs w:val="24"/>
-              </w:rPr>
-              <w:t>El usuario revisa que el total de la factura física/digital coincida con la suma manual de los artículos.</w:t>
+              <w:spacing w:after="40" w:line="276" w:lineRule="auto"/>
+              <w:rPr>
+                <w:rFonts w:ascii="Times New Roman" w:hAnsi="Times New Roman" w:cs="Times New Roman"/>
+              </w:rPr>
+            </w:pPr>
+            <w:r>
+              <w:rPr>
+                <w:rFonts w:ascii="Times New Roman" w:hAnsi="Times New Roman" w:cs="Times New Roman"/>
+              </w:rPr>
+              <w:t>Se suma en una calculadora el precio de los 3 productos y da exactamente el mismo total que dice el recibo que sacó el programa.</w:t>
             </w:r>
           </w:p>
         </w:tc>
@@ -1962,19 +1788,17 @@
       <w:tr>
         <w:tc>
           <w:tcPr>
-            <w:tcW w:w="0" w:type="auto"/>
-            <w:hideMark/>
-          </w:tcPr>
-          <w:p>
-            <w:pPr>
-              <w:tabs>
-                <w:tab w:val="left" w:pos="5730"/>
-              </w:tabs>
-              <w:spacing w:after="160"/>
-              <w:rPr>
-                <w:rFonts w:ascii="Times New Roman" w:hAnsi="Times New Roman" w:cs="Times New Roman"/>
-                <w:sz w:val="24"/>
-                <w:szCs w:val="24"/>
+            <w:tcW w:w="1129" w:type="dxa"/>
+            <w:hideMark/>
+          </w:tcPr>
+          <w:p>
+            <w:pPr>
+              <w:tabs>
+                <w:tab w:val="left" w:pos="5730"/>
+              </w:tabs>
+              <w:spacing w:after="40" w:line="276" w:lineRule="auto"/>
+              <w:rPr>
+                <w:rFonts w:ascii="Times New Roman" w:hAnsi="Times New Roman" w:cs="Times New Roman"/>
               </w:rPr>
             </w:pPr>
             <w:r>
@@ -1982,8 +1806,6 @@
                 <w:rFonts w:ascii="Times New Roman" w:hAnsi="Times New Roman" w:cs="Times New Roman"/>
                 <w:b/>
                 <w:bCs/>
-                <w:sz w:val="24"/>
-                <w:szCs w:val="24"/>
               </w:rPr>
               <w:t>ACC-03</w:t>
             </w:r>
@@ -1991,6 +1813,54 @@
         </w:tc>
         <w:tc>
           <w:tcPr>
+            <w:tcW w:w="1418" w:type="dxa"/>
+            <w:hideMark/>
+          </w:tcPr>
+          <w:p>
+            <w:pPr>
+              <w:tabs>
+                <w:tab w:val="left" w:pos="5730"/>
+              </w:tabs>
+              <w:spacing w:after="40" w:line="276" w:lineRule="auto"/>
+              <w:rPr>
+                <w:rFonts w:ascii="Times New Roman" w:hAnsi="Times New Roman" w:cs="Times New Roman"/>
+              </w:rPr>
+            </w:pPr>
+            <w:r>
+              <w:rPr>
+                <w:rFonts w:ascii="Times New Roman" w:hAnsi="Times New Roman" w:cs="Times New Roman"/>
+                <w:b/>
+                <w:bCs/>
+              </w:rPr>
+              <w:t>Descontar lo que se vende</w:t>
+            </w:r>
+          </w:p>
+        </w:tc>
+        <w:tc>
+          <w:tcPr>
+            <w:tcW w:w="1819" w:type="dxa"/>
+            <w:hideMark/>
+          </w:tcPr>
+          <w:p>
+            <w:pPr>
+              <w:tabs>
+                <w:tab w:val="left" w:pos="5730"/>
+              </w:tabs>
+              <w:spacing w:after="40" w:line="276" w:lineRule="auto"/>
+              <w:rPr>
+                <w:rFonts w:ascii="Times New Roman" w:hAnsi="Times New Roman" w:cs="Times New Roman"/>
+              </w:rPr>
+            </w:pPr>
+            <w:r>
+              <w:rPr>
+                <w:rFonts w:ascii="Times New Roman" w:hAnsi="Times New Roman" w:cs="Times New Roman"/>
+              </w:rPr>
+              <w:t>Se hace una venta de 2 unidades de un producto (por ejemplo, peluches) del cual había 10 guardados en la tienda.</w:t>
+            </w:r>
+          </w:p>
+        </w:tc>
+        <w:tc>
+          <w:tcPr>
             <w:tcW w:w="0" w:type="auto"/>
             <w:hideMark/>
           </w:tcPr>
@@ -1999,20 +1869,16 @@
               <w:tabs>
                 <w:tab w:val="left" w:pos="5730"/>
               </w:tabs>
-              <w:spacing w:after="160"/>
-              <w:rPr>
-                <w:rFonts w:ascii="Times New Roman" w:hAnsi="Times New Roman" w:cs="Times New Roman"/>
-                <w:sz w:val="24"/>
-                <w:szCs w:val="24"/>
-              </w:rPr>
-            </w:pPr>
-            <w:r>
-              <w:rPr>
-                <w:rFonts w:ascii="Times New Roman" w:hAnsi="Times New Roman" w:cs="Times New Roman"/>
-                <w:sz w:val="24"/>
-                <w:szCs w:val="24"/>
-              </w:rPr>
-              <w:t>Actualización de Inventario</w:t>
+              <w:spacing w:after="40" w:line="276" w:lineRule="auto"/>
+              <w:rPr>
+                <w:rFonts w:ascii="Times New Roman" w:hAnsi="Times New Roman" w:cs="Times New Roman"/>
+              </w:rPr>
+            </w:pPr>
+            <w:r>
+              <w:rPr>
+                <w:rFonts w:ascii="Times New Roman" w:hAnsi="Times New Roman" w:cs="Times New Roman"/>
+              </w:rPr>
+              <w:t>El programa resta automáticamente esos 2 peluches vendidos. Ahora el sistema debe decir que quedan 8.</w:t>
             </w:r>
           </w:p>
         </w:tc>
@@ -2026,74 +1892,16 @@
               <w:tabs>
                 <w:tab w:val="left" w:pos="5730"/>
               </w:tabs>
-              <w:spacing w:after="160"/>
-              <w:rPr>
-                <w:rFonts w:ascii="Times New Roman" w:hAnsi="Times New Roman" w:cs="Times New Roman"/>
-                <w:sz w:val="24"/>
-                <w:szCs w:val="24"/>
-              </w:rPr>
-            </w:pPr>
-            <w:r>
-              <w:rPr>
-                <w:rFonts w:ascii="Times New Roman" w:hAnsi="Times New Roman" w:cs="Times New Roman"/>
-                <w:sz w:val="24"/>
-                <w:szCs w:val="24"/>
-              </w:rPr>
-              <w:t>Se completa una venta de 2 unidades de un producto "X" que tenía 10 unidades en stock.</w:t>
-            </w:r>
-          </w:p>
-        </w:tc>
-        <w:tc>
-          <w:tcPr>
-            <w:tcW w:w="0" w:type="auto"/>
-            <w:hideMark/>
-          </w:tcPr>
-          <w:p>
-            <w:pPr>
-              <w:tabs>
-                <w:tab w:val="left" w:pos="5730"/>
-              </w:tabs>
-              <w:spacing w:after="160"/>
-              <w:rPr>
-                <w:rFonts w:ascii="Times New Roman" w:hAnsi="Times New Roman" w:cs="Times New Roman"/>
-                <w:sz w:val="24"/>
-                <w:szCs w:val="24"/>
-              </w:rPr>
-            </w:pPr>
-            <w:r>
-              <w:rPr>
-                <w:rFonts w:ascii="Times New Roman" w:hAnsi="Times New Roman" w:cs="Times New Roman"/>
-                <w:sz w:val="24"/>
-                <w:szCs w:val="24"/>
-              </w:rPr>
-              <w:t>El sistema descuenta automáticamente las 2 unidades vendidas. El nuevo stock debe ser 8.</w:t>
-            </w:r>
-          </w:p>
-        </w:tc>
-        <w:tc>
-          <w:tcPr>
-            <w:tcW w:w="0" w:type="auto"/>
-            <w:hideMark/>
-          </w:tcPr>
-          <w:p>
-            <w:pPr>
-              <w:tabs>
-                <w:tab w:val="left" w:pos="5730"/>
-              </w:tabs>
-              <w:spacing w:after="160"/>
-              <w:rPr>
-                <w:rFonts w:ascii="Times New Roman" w:hAnsi="Times New Roman" w:cs="Times New Roman"/>
-                <w:sz w:val="24"/>
-                <w:szCs w:val="24"/>
-              </w:rPr>
-            </w:pPr>
-            <w:r>
-              <w:rPr>
-                <w:rFonts w:ascii="Times New Roman" w:hAnsi="Times New Roman" w:cs="Times New Roman"/>
-                <w:sz w:val="24"/>
-                <w:szCs w:val="24"/>
-              </w:rPr>
-              <w:t>El gerente consulta el inventario del producto "X" y confirma que refleja exactamente 8 unidades.</w:t>
+              <w:spacing w:after="40" w:line="276" w:lineRule="auto"/>
+              <w:rPr>
+                <w:rFonts w:ascii="Times New Roman" w:hAnsi="Times New Roman" w:cs="Times New Roman"/>
+              </w:rPr>
+            </w:pPr>
+            <w:r>
+              <w:rPr>
+                <w:rFonts w:ascii="Times New Roman" w:hAnsi="Times New Roman" w:cs="Times New Roman"/>
+              </w:rPr>
+              <w:t>El gerente busca el peluche en el programa y confirma que el número bajó exactamente a 8 unidades disponibles.</w:t>
             </w:r>
           </w:p>
         </w:tc>
@@ -2101,19 +1909,17 @@
       <w:tr>
         <w:tc>
           <w:tcPr>
-            <w:tcW w:w="0" w:type="auto"/>
-            <w:hideMark/>
-          </w:tcPr>
-          <w:p>
-            <w:pPr>
-              <w:tabs>
-                <w:tab w:val="left" w:pos="5730"/>
-              </w:tabs>
-              <w:spacing w:after="160"/>
-              <w:rPr>
-                <w:rFonts w:ascii="Times New Roman" w:hAnsi="Times New Roman" w:cs="Times New Roman"/>
-                <w:sz w:val="24"/>
-                <w:szCs w:val="24"/>
+            <w:tcW w:w="1129" w:type="dxa"/>
+            <w:hideMark/>
+          </w:tcPr>
+          <w:p>
+            <w:pPr>
+              <w:tabs>
+                <w:tab w:val="left" w:pos="5730"/>
+              </w:tabs>
+              <w:spacing w:after="40" w:line="276" w:lineRule="auto"/>
+              <w:rPr>
+                <w:rFonts w:ascii="Times New Roman" w:hAnsi="Times New Roman" w:cs="Times New Roman"/>
               </w:rPr>
             </w:pPr>
             <w:r>
@@ -2121,8 +1927,6 @@
                 <w:rFonts w:ascii="Times New Roman" w:hAnsi="Times New Roman" w:cs="Times New Roman"/>
                 <w:b/>
                 <w:bCs/>
-                <w:sz w:val="24"/>
-                <w:szCs w:val="24"/>
               </w:rPr>
               <w:t>ACC-04</w:t>
             </w:r>
@@ -2130,6 +1934,54 @@
         </w:tc>
         <w:tc>
           <w:tcPr>
+            <w:tcW w:w="1418" w:type="dxa"/>
+            <w:hideMark/>
+          </w:tcPr>
+          <w:p>
+            <w:pPr>
+              <w:tabs>
+                <w:tab w:val="left" w:pos="5730"/>
+              </w:tabs>
+              <w:spacing w:after="40" w:line="276" w:lineRule="auto"/>
+              <w:rPr>
+                <w:rFonts w:ascii="Times New Roman" w:hAnsi="Times New Roman" w:cs="Times New Roman"/>
+              </w:rPr>
+            </w:pPr>
+            <w:r>
+              <w:rPr>
+                <w:rFonts w:ascii="Times New Roman" w:hAnsi="Times New Roman" w:cs="Times New Roman"/>
+                <w:b/>
+                <w:bCs/>
+              </w:rPr>
+              <w:t>Ingresar Mercancía Nueva</w:t>
+            </w:r>
+          </w:p>
+        </w:tc>
+        <w:tc>
+          <w:tcPr>
+            <w:tcW w:w="1819" w:type="dxa"/>
+            <w:hideMark/>
+          </w:tcPr>
+          <w:p>
+            <w:pPr>
+              <w:tabs>
+                <w:tab w:val="left" w:pos="5730"/>
+              </w:tabs>
+              <w:spacing w:after="40" w:line="276" w:lineRule="auto"/>
+              <w:rPr>
+                <w:rFonts w:ascii="Times New Roman" w:hAnsi="Times New Roman" w:cs="Times New Roman"/>
+              </w:rPr>
+            </w:pPr>
+            <w:r>
+              <w:rPr>
+                <w:rFonts w:ascii="Times New Roman" w:hAnsi="Times New Roman" w:cs="Times New Roman"/>
+              </w:rPr>
+              <w:t>El gerente le avisa al programa que acaban de llegar 20 unidades nuevas de un producto que ya venden.</w:t>
+            </w:r>
+          </w:p>
+        </w:tc>
+        <w:tc>
+          <w:tcPr>
             <w:tcW w:w="0" w:type="auto"/>
             <w:hideMark/>
           </w:tcPr>
@@ -2138,20 +1990,16 @@
               <w:tabs>
                 <w:tab w:val="left" w:pos="5730"/>
               </w:tabs>
-              <w:spacing w:after="160"/>
-              <w:rPr>
-                <w:rFonts w:ascii="Times New Roman" w:hAnsi="Times New Roman" w:cs="Times New Roman"/>
-                <w:sz w:val="24"/>
-                <w:szCs w:val="24"/>
-              </w:rPr>
-            </w:pPr>
-            <w:r>
-              <w:rPr>
-                <w:rFonts w:ascii="Times New Roman" w:hAnsi="Times New Roman" w:cs="Times New Roman"/>
-                <w:sz w:val="24"/>
-                <w:szCs w:val="24"/>
-              </w:rPr>
-              <w:t>Entrada de Mercancía</w:t>
+              <w:spacing w:after="40" w:line="276" w:lineRule="auto"/>
+              <w:rPr>
+                <w:rFonts w:ascii="Times New Roman" w:hAnsi="Times New Roman" w:cs="Times New Roman"/>
+              </w:rPr>
+            </w:pPr>
+            <w:r>
+              <w:rPr>
+                <w:rFonts w:ascii="Times New Roman" w:hAnsi="Times New Roman" w:cs="Times New Roman"/>
+              </w:rPr>
+              <w:t>El programa suma esas 20 unidades a las que ya había antes, de forma inmediata.</w:t>
             </w:r>
           </w:p>
         </w:tc>
@@ -2165,74 +2013,16 @@
               <w:tabs>
                 <w:tab w:val="left" w:pos="5730"/>
               </w:tabs>
-              <w:spacing w:after="160"/>
-              <w:rPr>
-                <w:rFonts w:ascii="Times New Roman" w:hAnsi="Times New Roman" w:cs="Times New Roman"/>
-                <w:sz w:val="24"/>
-                <w:szCs w:val="24"/>
-              </w:rPr>
-            </w:pPr>
-            <w:r>
-              <w:rPr>
-                <w:rFonts w:ascii="Times New Roman" w:hAnsi="Times New Roman" w:cs="Times New Roman"/>
-                <w:sz w:val="24"/>
-                <w:szCs w:val="24"/>
-              </w:rPr>
-              <w:t>El gerente registra la entrada de 20 unidades nuevas de un producto existente.</w:t>
-            </w:r>
-          </w:p>
-        </w:tc>
-        <w:tc>
-          <w:tcPr>
-            <w:tcW w:w="0" w:type="auto"/>
-            <w:hideMark/>
-          </w:tcPr>
-          <w:p>
-            <w:pPr>
-              <w:tabs>
-                <w:tab w:val="left" w:pos="5730"/>
-              </w:tabs>
-              <w:spacing w:after="160"/>
-              <w:rPr>
-                <w:rFonts w:ascii="Times New Roman" w:hAnsi="Times New Roman" w:cs="Times New Roman"/>
-                <w:sz w:val="24"/>
-                <w:szCs w:val="24"/>
-              </w:rPr>
-            </w:pPr>
-            <w:r>
-              <w:rPr>
-                <w:rFonts w:ascii="Times New Roman" w:hAnsi="Times New Roman" w:cs="Times New Roman"/>
-                <w:sz w:val="24"/>
-                <w:szCs w:val="24"/>
-              </w:rPr>
-              <w:t>El inventario del producto suma las 20 unidades a la cantidad actual disponible de forma inmediata.</w:t>
-            </w:r>
-          </w:p>
-        </w:tc>
-        <w:tc>
-          <w:tcPr>
-            <w:tcW w:w="0" w:type="auto"/>
-            <w:hideMark/>
-          </w:tcPr>
-          <w:p>
-            <w:pPr>
-              <w:tabs>
-                <w:tab w:val="left" w:pos="5730"/>
-              </w:tabs>
-              <w:spacing w:after="160"/>
-              <w:rPr>
-                <w:rFonts w:ascii="Times New Roman" w:hAnsi="Times New Roman" w:cs="Times New Roman"/>
-                <w:sz w:val="24"/>
-                <w:szCs w:val="24"/>
-              </w:rPr>
-            </w:pPr>
-            <w:r>
-              <w:rPr>
-                <w:rFonts w:ascii="Times New Roman" w:hAnsi="Times New Roman" w:cs="Times New Roman"/>
-                <w:sz w:val="24"/>
-                <w:szCs w:val="24"/>
-              </w:rPr>
-              <w:t>El gerente busca el producto en el catálogo y valida que la cantidad disponible aumentó correctamente.</w:t>
+              <w:spacing w:after="40" w:line="276" w:lineRule="auto"/>
+              <w:rPr>
+                <w:rFonts w:ascii="Times New Roman" w:hAnsi="Times New Roman" w:cs="Times New Roman"/>
+              </w:rPr>
+            </w:pPr>
+            <w:r>
+              <w:rPr>
+                <w:rFonts w:ascii="Times New Roman" w:hAnsi="Times New Roman" w:cs="Times New Roman"/>
+              </w:rPr>
+              <w:t>El gerente busca el producto en el programa y ve que la cantidad total creció correctamente con los 20 nuevos.</w:t>
             </w:r>
           </w:p>
         </w:tc>
@@ -2240,19 +2030,17 @@
       <w:tr>
         <w:tc>
           <w:tcPr>
-            <w:tcW w:w="0" w:type="auto"/>
-            <w:hideMark/>
-          </w:tcPr>
-          <w:p>
-            <w:pPr>
-              <w:tabs>
-                <w:tab w:val="left" w:pos="5730"/>
-              </w:tabs>
-              <w:spacing w:after="160"/>
-              <w:rPr>
-                <w:rFonts w:ascii="Times New Roman" w:hAnsi="Times New Roman" w:cs="Times New Roman"/>
-                <w:sz w:val="24"/>
-                <w:szCs w:val="24"/>
+            <w:tcW w:w="1129" w:type="dxa"/>
+            <w:hideMark/>
+          </w:tcPr>
+          <w:p>
+            <w:pPr>
+              <w:tabs>
+                <w:tab w:val="left" w:pos="5730"/>
+              </w:tabs>
+              <w:spacing w:after="40" w:line="276" w:lineRule="auto"/>
+              <w:rPr>
+                <w:rFonts w:ascii="Times New Roman" w:hAnsi="Times New Roman" w:cs="Times New Roman"/>
               </w:rPr>
             </w:pPr>
             <w:r>
@@ -2260,8 +2048,6 @@
                 <w:rFonts w:ascii="Times New Roman" w:hAnsi="Times New Roman" w:cs="Times New Roman"/>
                 <w:b/>
                 <w:bCs/>
-                <w:sz w:val="24"/>
-                <w:szCs w:val="24"/>
               </w:rPr>
               <w:t>ACC-05</w:t>
             </w:r>
@@ -2269,6 +2055,54 @@
         </w:tc>
         <w:tc>
           <w:tcPr>
+            <w:tcW w:w="1418" w:type="dxa"/>
+            <w:hideMark/>
+          </w:tcPr>
+          <w:p>
+            <w:pPr>
+              <w:tabs>
+                <w:tab w:val="left" w:pos="5730"/>
+              </w:tabs>
+              <w:spacing w:after="40" w:line="276" w:lineRule="auto"/>
+              <w:rPr>
+                <w:rFonts w:ascii="Times New Roman" w:hAnsi="Times New Roman" w:cs="Times New Roman"/>
+              </w:rPr>
+            </w:pPr>
+            <w:r>
+              <w:rPr>
+                <w:rFonts w:ascii="Times New Roman" w:hAnsi="Times New Roman" w:cs="Times New Roman"/>
+                <w:b/>
+                <w:bCs/>
+              </w:rPr>
+              <w:t>Revisar cuánto se ha vendido</w:t>
+            </w:r>
+          </w:p>
+        </w:tc>
+        <w:tc>
+          <w:tcPr>
+            <w:tcW w:w="1819" w:type="dxa"/>
+            <w:hideMark/>
+          </w:tcPr>
+          <w:p>
+            <w:pPr>
+              <w:tabs>
+                <w:tab w:val="left" w:pos="5730"/>
+              </w:tabs>
+              <w:spacing w:after="40" w:line="276" w:lineRule="auto"/>
+              <w:rPr>
+                <w:rFonts w:ascii="Times New Roman" w:hAnsi="Times New Roman" w:cs="Times New Roman"/>
+              </w:rPr>
+            </w:pPr>
+            <w:r>
+              <w:rPr>
+                <w:rFonts w:ascii="Times New Roman" w:hAnsi="Times New Roman" w:cs="Times New Roman"/>
+              </w:rPr>
+              <w:t>El gerente pide ver las ventas de unos días específicos (por ejemplo, la última semana).</w:t>
+            </w:r>
+          </w:p>
+        </w:tc>
+        <w:tc>
+          <w:tcPr>
             <w:tcW w:w="0" w:type="auto"/>
             <w:hideMark/>
           </w:tcPr>
@@ -2277,20 +2111,16 @@
               <w:tabs>
                 <w:tab w:val="left" w:pos="5730"/>
               </w:tabs>
-              <w:spacing w:after="160"/>
-              <w:rPr>
-                <w:rFonts w:ascii="Times New Roman" w:hAnsi="Times New Roman" w:cs="Times New Roman"/>
-                <w:sz w:val="24"/>
-                <w:szCs w:val="24"/>
-              </w:rPr>
-            </w:pPr>
-            <w:r>
-              <w:rPr>
-                <w:rFonts w:ascii="Times New Roman" w:hAnsi="Times New Roman" w:cs="Times New Roman"/>
-                <w:sz w:val="24"/>
-                <w:szCs w:val="24"/>
-              </w:rPr>
-              <w:t>Reportes de Ventas</w:t>
+              <w:spacing w:after="40" w:line="276" w:lineRule="auto"/>
+              <w:rPr>
+                <w:rFonts w:ascii="Times New Roman" w:hAnsi="Times New Roman" w:cs="Times New Roman"/>
+              </w:rPr>
+            </w:pPr>
+            <w:r>
+              <w:rPr>
+                <w:rFonts w:ascii="Times New Roman" w:hAnsi="Times New Roman" w:cs="Times New Roman"/>
+              </w:rPr>
+              <w:t>El programa le muestra un resumen claro con toda la plata que entró y la lista de todo lo que se vendió en esos días.</w:t>
             </w:r>
           </w:p>
         </w:tc>
@@ -2304,93 +2134,16 @@
               <w:tabs>
                 <w:tab w:val="left" w:pos="5730"/>
               </w:tabs>
-              <w:spacing w:after="160"/>
-              <w:rPr>
-                <w:rFonts w:ascii="Times New Roman" w:hAnsi="Times New Roman" w:cs="Times New Roman"/>
-                <w:sz w:val="24"/>
-                <w:szCs w:val="24"/>
-              </w:rPr>
-            </w:pPr>
-            <w:r>
-              <w:rPr>
-                <w:rFonts w:ascii="Times New Roman" w:hAnsi="Times New Roman" w:cs="Times New Roman"/>
-                <w:sz w:val="24"/>
-                <w:szCs w:val="24"/>
-              </w:rPr>
-              <w:t xml:space="preserve">El gerente selecciona un rango de fechas (ej. la última semana) para </w:t>
-            </w:r>
-            <w:r>
-              <w:rPr>
-                <w:rFonts w:ascii="Times New Roman" w:hAnsi="Times New Roman" w:cs="Times New Roman"/>
-                <w:sz w:val="24"/>
-                <w:szCs w:val="24"/>
-              </w:rPr>
-              <w:lastRenderedPageBreak/>
-              <w:t>generar un reporte.</w:t>
-            </w:r>
-          </w:p>
-        </w:tc>
-        <w:tc>
-          <w:tcPr>
-            <w:tcW w:w="0" w:type="auto"/>
-            <w:hideMark/>
-          </w:tcPr>
-          <w:p>
-            <w:pPr>
-              <w:tabs>
-                <w:tab w:val="left" w:pos="5730"/>
-              </w:tabs>
-              <w:spacing w:after="160"/>
-              <w:rPr>
-                <w:rFonts w:ascii="Times New Roman" w:hAnsi="Times New Roman" w:cs="Times New Roman"/>
-                <w:sz w:val="24"/>
-                <w:szCs w:val="24"/>
-              </w:rPr>
-            </w:pPr>
-            <w:r>
-              <w:rPr>
-                <w:rFonts w:ascii="Times New Roman" w:hAnsi="Times New Roman" w:cs="Times New Roman"/>
-                <w:sz w:val="24"/>
-                <w:szCs w:val="24"/>
-              </w:rPr>
-              <w:lastRenderedPageBreak/>
-              <w:t>El sistema compila y muestra un informe detallado con los ingresos totales y la lista de ventas de ese periodo.</w:t>
-            </w:r>
-          </w:p>
-        </w:tc>
-        <w:tc>
-          <w:tcPr>
-            <w:tcW w:w="0" w:type="auto"/>
-            <w:hideMark/>
-          </w:tcPr>
-          <w:p>
-            <w:pPr>
-              <w:tabs>
-                <w:tab w:val="left" w:pos="5730"/>
-              </w:tabs>
-              <w:spacing w:after="160"/>
-              <w:rPr>
-                <w:rFonts w:ascii="Times New Roman" w:hAnsi="Times New Roman" w:cs="Times New Roman"/>
-                <w:sz w:val="24"/>
-                <w:szCs w:val="24"/>
-              </w:rPr>
-            </w:pPr>
-            <w:r>
-              <w:rPr>
-                <w:rFonts w:ascii="Times New Roman" w:hAnsi="Times New Roman" w:cs="Times New Roman"/>
-                <w:sz w:val="24"/>
-                <w:szCs w:val="24"/>
-              </w:rPr>
-              <w:t xml:space="preserve">El usuario contrasta el reporte del sistema contra los registros físicos de esa semana </w:t>
-            </w:r>
-            <w:r>
-              <w:rPr>
-                <w:rFonts w:ascii="Times New Roman" w:hAnsi="Times New Roman" w:cs="Times New Roman"/>
-                <w:sz w:val="24"/>
-                <w:szCs w:val="24"/>
-              </w:rPr>
-              <w:lastRenderedPageBreak/>
-              <w:t>para verificar la exactitud de los datos.</w:t>
+              <w:spacing w:after="40" w:line="276" w:lineRule="auto"/>
+              <w:rPr>
+                <w:rFonts w:ascii="Times New Roman" w:hAnsi="Times New Roman" w:cs="Times New Roman"/>
+              </w:rPr>
+            </w:pPr>
+            <w:r>
+              <w:rPr>
+                <w:rFonts w:ascii="Times New Roman" w:hAnsi="Times New Roman" w:cs="Times New Roman"/>
+              </w:rPr>
+              <w:t>El gerente compara este resumen con sus cuentas en papel (o facturas físicas) para asegurarse de que el programa no se equivocó en ningún número.</w:t>
             </w:r>
           </w:p>
         </w:tc>
@@ -2408,19 +2161,41 @@
           <w:szCs w:val="24"/>
         </w:rPr>
       </w:pPr>
+    </w:p>
+    <w:p>
+      <w:pPr>
+        <w:tabs>
+          <w:tab w:val="left" w:pos="5730"/>
+        </w:tabs>
+        <w:spacing w:line="360" w:lineRule="auto"/>
+        <w:rPr>
+          <w:rFonts w:ascii="Times New Roman" w:hAnsi="Times New Roman" w:cs="Times New Roman"/>
+          <w:sz w:val="24"/>
+          <w:szCs w:val="24"/>
+        </w:rPr>
+      </w:pPr>
+    </w:p>
+    <w:p>
+      <w:pPr>
+        <w:tabs>
+          <w:tab w:val="left" w:pos="5730"/>
+        </w:tabs>
+        <w:spacing w:line="360" w:lineRule="auto"/>
+        <w:rPr>
+          <w:rFonts w:ascii="Times New Roman" w:hAnsi="Times New Roman" w:cs="Times New Roman"/>
+          <w:sz w:val="24"/>
+          <w:szCs w:val="24"/>
+        </w:rPr>
+      </w:pPr>
       <w:r>
         <w:rPr>
-          <w:rFonts w:ascii="Times New Roman" w:hAnsi="Times New Roman" w:cs="Times New Roman"/>
           <w:noProof/>
-          <w:sz w:val="24"/>
-          <w:szCs w:val="24"/>
-        </w:rPr>
-        <w:lastRenderedPageBreak/>
+        </w:rPr>
         <w:drawing>
-          <wp:inline distT="0" distB="0" distL="0" distR="0" wp14:anchorId="0875C082" wp14:editId="6C54E9A9">
-            <wp:extent cx="5612130" cy="3058160"/>
-            <wp:effectExtent l="0" t="0" r="7620" b="8890"/>
-            <wp:docPr id="26279096" name="Imagen 1"/>
+          <wp:inline distT="0" distB="0" distL="0" distR="0" wp14:anchorId="59403213" wp14:editId="16A073A1">
+            <wp:extent cx="5612130" cy="3156585"/>
+            <wp:effectExtent l="0" t="0" r="7620" b="5715"/>
+            <wp:docPr id="1128953993" name="Imagen 1"/>
             <wp:cNvGraphicFramePr>
               <a:graphicFrameLocks xmlns:a="http://schemas.openxmlformats.org/drawingml/2006/main" noChangeAspect="1"/>
             </wp:cNvGraphicFramePr>
@@ -2428,8 +2203,10 @@
               <a:graphicData uri="http://schemas.openxmlformats.org/drawingml/2006/picture">
                 <pic:pic xmlns:pic="http://schemas.openxmlformats.org/drawingml/2006/picture">
                   <pic:nvPicPr>
-                    <pic:cNvPr id="26279096" name="Imagen 26279096"/>
-                    <pic:cNvPicPr/>
+                    <pic:cNvPr id="0" name="Picture 1"/>
+                    <pic:cNvPicPr>
+                      <a:picLocks noChangeAspect="1" noChangeArrowheads="1"/>
+                    </pic:cNvPicPr>
                   </pic:nvPicPr>
                   <pic:blipFill>
                     <a:blip r:embed="rId5" cstate="print">
@@ -2439,18 +2216,23 @@
                         </a:ext>
                       </a:extLst>
                     </a:blip>
+                    <a:srcRect/>
                     <a:stretch>
                       <a:fillRect/>
                     </a:stretch>
                   </pic:blipFill>
-                  <pic:spPr>
+                  <pic:spPr bwMode="auto">
                     <a:xfrm>
                       <a:off x="0" y="0"/>
-                      <a:ext cx="5612130" cy="3058160"/>
+                      <a:ext cx="5612130" cy="3156585"/>
                     </a:xfrm>
                     <a:prstGeom prst="rect">
                       <a:avLst/>
                     </a:prstGeom>
+                    <a:noFill/>
+                    <a:ln>
+                      <a:noFill/>
+                    </a:ln>
                   </pic:spPr>
                 </pic:pic>
               </a:graphicData>
@@ -2458,6 +2240,32 @@
           </wp:inline>
         </w:drawing>
       </w:r>
+    </w:p>
+    <w:p>
+      <w:pPr>
+        <w:tabs>
+          <w:tab w:val="left" w:pos="5730"/>
+        </w:tabs>
+        <w:spacing w:line="360" w:lineRule="auto"/>
+        <w:rPr>
+          <w:rFonts w:ascii="Times New Roman" w:hAnsi="Times New Roman" w:cs="Times New Roman"/>
+          <w:sz w:val="24"/>
+          <w:szCs w:val="24"/>
+        </w:rPr>
+      </w:pPr>
+    </w:p>
+    <w:p>
+      <w:pPr>
+        <w:tabs>
+          <w:tab w:val="left" w:pos="5730"/>
+        </w:tabs>
+        <w:spacing w:line="360" w:lineRule="auto"/>
+        <w:rPr>
+          <w:rFonts w:ascii="Times New Roman" w:hAnsi="Times New Roman" w:cs="Times New Roman"/>
+          <w:sz w:val="24"/>
+          <w:szCs w:val="24"/>
+        </w:rPr>
+      </w:pPr>
     </w:p>
     <w:p/>
     <w:sectPr>
@@ -3234,7 +3042,6 @@
   <w:style w:type="character" w:default="1" w:styleId="Fuentedeprrafopredeter">
     <w:name w:val="Default Paragraph Font"/>
     <w:uiPriority w:val="1"/>
-    <w:semiHidden/>
     <w:unhideWhenUsed/>
   </w:style>
   <w:style w:type="table" w:default="1" w:styleId="Tablanormal">

</xml_diff>